<commit_message>
idfc docx tempalte + cleanup
</commit_message>
<xml_diff>
--- a/simple.docx
+++ b/simple.docx
@@ -23,6 +23,7 @@
           <w:u w:val="none"/>
         </w:rPr>
         <w:t xml:space="preserve"> Heading 1</w:t>
+        <w:br/>
       </w:r>
     </w:p>
     <w:p>
@@ -36,6 +37,7 @@
           <w:u w:val="none"/>
         </w:rPr>
         <w:t xml:space="preserve"> Heading 2</w:t>
+        <w:br/>
       </w:r>
     </w:p>
     <w:p>
@@ -49,6 +51,7 @@
           <w:u w:val="none"/>
         </w:rPr>
         <w:t xml:space="preserve"> Heading 3</w:t>
+        <w:br/>
       </w:r>
     </w:p>
     <w:p>
@@ -59,6 +62,7 @@
           <w:u w:val="none"/>
         </w:rPr>
         <w:t xml:space="preserve"> Strong para</w:t>
+        <w:br/>
       </w:r>
     </w:p>
     <w:p/>
@@ -77,6 +81,7 @@
           <w:u w:val="none"/>
         </w:rPr>
         <w:t xml:space="preserve"> one</w:t>
+        <w:br/>
       </w:r>
     </w:p>
     <w:p>
@@ -94,6 +99,7 @@
           <w:u w:val="none"/>
         </w:rPr>
         <w:t xml:space="preserve"> two</w:t>
+        <w:br/>
       </w:r>
     </w:p>
     <w:p>
@@ -111,6 +117,7 @@
           <w:u w:val="none"/>
         </w:rPr>
         <w:t xml:space="preserve"> three</w:t>
+        <w:br/>
       </w:r>
     </w:p>
     <w:p>
@@ -145,6 +152,7 @@
           <w:u w:val="none"/>
         </w:rPr>
         <w:t xml:space="preserve"> one.one</w:t>
+        <w:br/>
       </w:r>
     </w:p>
     <w:p>
@@ -162,6 +170,7 @@
           <w:u w:val="none"/>
         </w:rPr>
         <w:t xml:space="preserve"> one.two</w:t>
+        <w:br/>
       </w:r>
     </w:p>
     <w:p>
@@ -179,6 +188,7 @@
           <w:u w:val="none"/>
         </w:rPr>
         <w:t xml:space="preserve"> one.three.one</w:t>
+        <w:br/>
       </w:r>
     </w:p>
     <w:p>
@@ -196,6 +206,52 @@
           <w:u w:val="none"/>
         </w:rPr>
         <w:t xml:space="preserve"> one.three.two</w:t>
+        <w:br/>
+      </w:r>
+    </w:p>
+    <w:p>
+      <w:pPr>
+        <w:pStyle w:val="ListParagraph"/>
+        <w:numPr>
+          <w:ilvl w:val="2"/>
+          <w:numId w:val="1"/>
+        </w:numPr>
+      </w:pPr>
+    </w:p>
+    <w:p>
+      <w:pPr>
+        <w:pStyle w:val="ListParagraph"/>
+        <w:numPr>
+          <w:ilvl w:val="3"/>
+          <w:numId w:val="1"/>
+        </w:numPr>
+      </w:pPr>
+      <w:r>
+        <w:rPr>
+          <w:b w:val="0"/>
+          <w:i w:val="0"/>
+          <w:u w:val="none"/>
+        </w:rPr>
+        <w:t xml:space="preserve"> one.three.three.one</w:t>
+        <w:br/>
+      </w:r>
+    </w:p>
+    <w:p>
+      <w:pPr>
+        <w:pStyle w:val="ListParagraph"/>
+        <w:numPr>
+          <w:ilvl w:val="3"/>
+          <w:numId w:val="1"/>
+        </w:numPr>
+      </w:pPr>
+      <w:r>
+        <w:rPr>
+          <w:b w:val="0"/>
+          <w:i w:val="0"/>
+          <w:u w:val="none"/>
+        </w:rPr>
+        <w:t xml:space="preserve"> one.three.four.two</w:t>
+        <w:br/>
       </w:r>
     </w:p>
     <w:p>
@@ -213,6 +269,7 @@
           <w:u w:val="none"/>
         </w:rPr>
         <w:t xml:space="preserve"> five</w:t>
+        <w:br/>
       </w:r>
     </w:p>
     <w:p/>
@@ -231,6 +288,7 @@
           <w:u w:val="none"/>
         </w:rPr>
         <w:t xml:space="preserve"> [List 2]one</w:t>
+        <w:br/>
       </w:r>
     </w:p>
     <w:p>
@@ -248,6 +306,7 @@
           <w:u w:val="none"/>
         </w:rPr>
         <w:t xml:space="preserve"> [List 2] two</w:t>
+        <w:br/>
       </w:r>
     </w:p>
     <w:p>
@@ -265,6 +324,7 @@
           <w:u w:val="none"/>
         </w:rPr>
         <w:t xml:space="preserve"> [List 2] three</w:t>
+        <w:br/>
       </w:r>
     </w:p>
     <w:p/>
@@ -283,6 +343,7 @@
           <w:u w:val="none"/>
         </w:rPr>
         <w:t xml:space="preserve"> [List 3]one</w:t>
+        <w:br/>
       </w:r>
     </w:p>
     <w:p>
@@ -300,6 +361,7 @@
           <w:u w:val="none"/>
         </w:rPr>
         <w:t xml:space="preserve"> [List 3] two</w:t>
+        <w:br/>
       </w:r>
     </w:p>
     <w:p>
@@ -317,6 +379,7 @@
           <w:u w:val="none"/>
         </w:rPr>
         <w:t xml:space="preserve"> [List 3] three</w:t>
+        <w:br/>
       </w:r>
     </w:p>
     <w:sectPr>

</xml_diff>